<commit_message>
Updated to include the Methodology section
Updated to include the Methodology section
</commit_message>
<xml_diff>
--- a/SMS.docx
+++ b/SMS.docx
@@ -299,6 +299,65 @@
       </w:pPr>
       <w:r>
         <w:t>The integration of technologies such as automation, radar sensors, industrial PCs, advanced security systems, and cloud computing into store management has significantly improved retail operations. These advancements contribute to more accurate inventory management, streamlined processes, and enhanced customer experiences. As technology continues to evolve, its role in transforming retail store management is expected to expand further.</w:t>
+      </w:r>
+    </w:p>
+    <w:p>
+      <w:pPr>
+        <w:pStyle w:val="Heading1"/>
+      </w:pPr>
+      <w:r>
+        <w:t>Methodology</w:t>
+      </w:r>
+    </w:p>
+    <w:p>
+      <w:pPr>
+        <w:jc w:val="both"/>
+      </w:pPr>
+      <w:r>
+        <w:t>The development of the Store Management System involved using a structured database to store and manage data such as store information, product details, inventory levels, and customer reviews. A MySQL database was chosen for its reliability and ease of integration with web-based systems.</w:t>
+      </w:r>
+    </w:p>
+    <w:p>
+      <w:pPr>
+        <w:jc w:val="both"/>
+      </w:pPr>
+    </w:p>
+    <w:p>
+      <w:pPr>
+        <w:jc w:val="both"/>
+      </w:pPr>
+      <w:r>
+        <w:t xml:space="preserve">The system includes both a user-facing interface and an administrative backend, allowing users to search for nearby stores and view product availability, while enabling store </w:t>
+      </w:r>
+      <w:r>
+        <w:lastRenderedPageBreak/>
+        <w:t>owners to update their inventory and respond to customer feedback. Web development tools were used to design a responsive and user-friendly interface that works across different devices.</w:t>
+      </w:r>
+    </w:p>
+    <w:p>
+      <w:pPr>
+        <w:jc w:val="both"/>
+      </w:pPr>
+    </w:p>
+    <w:p>
+      <w:pPr>
+        <w:jc w:val="both"/>
+      </w:pPr>
+      <w:r>
+        <w:t>To improve the shopping experience, the project integrates geolocation features using the Google Maps API, allowing users to find stores based on their current location. The system was developed and tested on a standard Windows environment, using widely available software tools suitable for academic and small-scale project development.</w:t>
+      </w:r>
+    </w:p>
+    <w:p>
+      <w:pPr>
+        <w:jc w:val="both"/>
+      </w:pPr>
+    </w:p>
+    <w:p>
+      <w:pPr>
+        <w:jc w:val="both"/>
+      </w:pPr>
+      <w:r>
+        <w:t>This approach ensured that the final system was functional, efficient, and easy to maintain, meeting the needs of both customers and retailers.</w:t>
       </w:r>
     </w:p>
     <w:p>
@@ -521,15 +580,7 @@
           <w:sz w:val="16"/>
           <w:szCs w:val="16"/>
         </w:rPr>
-        <w:t xml:space="preserve">, Kiruthik Prakash J, Naveen Kumar D, and Muneera Begum H, "Industrial PC-Based Automated Store Management </w:t>
-      </w:r>
-      <w:r>
-        <w:rPr>
-          <w:sz w:val="16"/>
-          <w:szCs w:val="16"/>
-        </w:rPr>
-        <w:lastRenderedPageBreak/>
-        <w:t xml:space="preserve">System," in </w:t>
+        <w:t xml:space="preserve">, Kiruthik Prakash J, Naveen Kumar D, and Muneera Begum H, "Industrial PC-Based Automated Store Management System," in </w:t>
       </w:r>
       <w:r>
         <w:rPr>
@@ -2969,6 +3020,7 @@
   <w:style w:type="character" w:default="1" w:styleId="DefaultParagraphFont">
     <w:name w:val="Default Paragraph Font"/>
     <w:uiPriority w:val="1"/>
+    <w:semiHidden/>
     <w:unhideWhenUsed/>
   </w:style>
   <w:style w:type="table" w:default="1" w:styleId="TableNormal">

</xml_diff>